<commit_message>
Expand reference to 12 categories and 140 units; refresh reports
- add speed, pressure, energy, power, force and data categories and
  70+ units (historical Russian and imperial measures included)
- widen units.factor to NUMERIC(60,32) for very small constants
- rebuild reports: Russian proofing language, every section and
  subsection starts on a new page
- retake stale screenshots for labs 3-5
</commit_message>
<xml_diff>
--- a/docs/lab-01/Отчёт_ЛР1_Соболев.docx
+++ b/docs/lab-01/Отчёт_ЛР1_Соболев.docx
@@ -345,13 +345,9 @@
       </w:r>
     </w:p>
     <w:p>
-      <w:r>
-        <w:br w:type="page"/>
-      </w:r>
-    </w:p>
-    <w:p>
       <w:pPr>
         <w:pStyle w:val="Heading1"/>
+        <w:pageBreakBefore/>
       </w:pPr>
       <w:r>
         <w:t>РЕФЕРАТ</w:t>
@@ -493,13 +489,9 @@
       </w:r>
     </w:p>
     <w:p>
-      <w:r>
-        <w:br w:type="page"/>
-      </w:r>
-    </w:p>
-    <w:p>
       <w:pPr>
         <w:pStyle w:val="Heading1"/>
+        <w:pageBreakBefore/>
       </w:pPr>
       <w:r>
         <w:t>СОДЕРЖАНИЕ</w:t>
@@ -554,7 +546,7 @@
       <w:r>
         <w:t>1.1 Анализ предметной области</w:t>
         <w:tab/>
-        <w:t>5</w:t>
+        <w:t>6</w:t>
       </w:r>
     </w:p>
     <w:p>
@@ -567,7 +559,7 @@
       <w:r>
         <w:t>1.2 Перечень страниц и состояний интерфейса</w:t>
         <w:tab/>
-        <w:t>5</w:t>
+        <w:t>7</w:t>
       </w:r>
     </w:p>
     <w:p>
@@ -580,7 +572,7 @@
       <w:r>
         <w:t>1.3 Структура файла прототипов</w:t>
         <w:tab/>
-        <w:t>6</w:t>
+        <w:t>8</w:t>
       </w:r>
     </w:p>
     <w:p>
@@ -593,7 +585,7 @@
       <w:r>
         <w:t>1.4 Адаптация интерфейса для трёх разрешений</w:t>
         <w:tab/>
-        <w:t>6</w:t>
+        <w:t>9</w:t>
       </w:r>
     </w:p>
     <w:p>
@@ -606,7 +598,7 @@
       <w:r>
         <w:t>1.5 Результаты: снимки экрана</w:t>
         <w:tab/>
-        <w:t>6</w:t>
+        <w:t>10</w:t>
       </w:r>
     </w:p>
     <w:p>
@@ -619,7 +611,7 @@
       <w:r>
         <w:t>ЗАКЛЮЧЕНИЕ</w:t>
         <w:tab/>
-        <w:t>13</w:t>
+        <w:t>16</w:t>
       </w:r>
     </w:p>
     <w:p>
@@ -632,18 +624,14 @@
       <w:r>
         <w:t>СПИСОК ИСПОЛЬЗОВАННЫХ ИСТОЧНИКОВ</w:t>
         <w:tab/>
-        <w:t>14</w:t>
+        <w:t>17</w:t>
       </w:r>
     </w:p>
     <w:p/>
     <w:p>
-      <w:r>
-        <w:br w:type="page"/>
-      </w:r>
-    </w:p>
-    <w:p>
       <w:pPr>
         <w:pStyle w:val="Heading1"/>
+        <w:pageBreakBefore/>
       </w:pPr>
       <w:r>
         <w:t>ВВЕДЕНИЕ</w:t>
@@ -779,13 +767,9 @@
       </w:r>
     </w:p>
     <w:p>
-      <w:r>
-        <w:br w:type="page"/>
-      </w:r>
-    </w:p>
-    <w:p>
       <w:pPr>
         <w:pStyle w:val="Heading1"/>
+        <w:pageBreakBefore/>
       </w:pPr>
       <w:r>
         <w:t>1 ОСНОВНАЯ ЧАСТЬ</w:t>
@@ -794,6 +778,7 @@
     <w:p>
       <w:pPr>
         <w:pStyle w:val="Heading2"/>
+        <w:pageBreakBefore/>
       </w:pPr>
       <w:r>
         <w:t>1.1 Анализ предметной области</w:t>
@@ -828,6 +813,7 @@
     <w:p>
       <w:pPr>
         <w:pStyle w:val="Heading2"/>
+        <w:pageBreakBefore/>
       </w:pPr>
       <w:r>
         <w:t>1.2 Перечень страниц и состояний интерфейса</w:t>
@@ -1591,6 +1577,7 @@
     <w:p>
       <w:pPr>
         <w:pStyle w:val="Heading2"/>
+        <w:pageBreakBefore/>
       </w:pPr>
       <w:r>
         <w:t>1.3 Структура файла прототипов</w:t>
@@ -2020,6 +2007,7 @@
     <w:p>
       <w:pPr>
         <w:pStyle w:val="Heading2"/>
+        <w:pageBreakBefore/>
       </w:pPr>
       <w:r>
         <w:t>1.4 Адаптация интерфейса для трёх разрешений</w:t>
@@ -2580,6 +2568,7 @@
     <w:p>
       <w:pPr>
         <w:pStyle w:val="Heading2"/>
+        <w:pageBreakBefore/>
       </w:pPr>
       <w:r>
         <w:t>1.5 Результаты: снимки экрана</w:t>
@@ -3325,13 +3314,9 @@
       </w:r>
     </w:p>
     <w:p>
-      <w:r>
-        <w:br w:type="page"/>
-      </w:r>
-    </w:p>
-    <w:p>
       <w:pPr>
         <w:pStyle w:val="Heading1"/>
+        <w:pageBreakBefore/>
       </w:pPr>
       <w:r>
         <w:t>ЗАКЛЮЧЕНИЕ</w:t>
@@ -3364,13 +3349,9 @@
       </w:r>
     </w:p>
     <w:p>
-      <w:r>
-        <w:br w:type="page"/>
-      </w:r>
-    </w:p>
-    <w:p>
       <w:pPr>
         <w:pStyle w:val="Heading1"/>
+        <w:pageBreakBefore/>
       </w:pPr>
       <w:r>
         <w:t>СПИСОК ИСПОЛЬЗОВАННЫХ ИСТОЧНИКОВ</w:t>
@@ -3701,7 +3682,7 @@
         <w:rFonts w:asciiTheme="minorHAnsi" w:eastAsiaTheme="minorEastAsia" w:hAnsiTheme="minorHAnsi" w:cstheme="minorBidi"/>
         <w:sz w:val="22"/>
         <w:szCs w:val="22"/>
-        <w:lang w:val="en-US" w:eastAsia="en-US" w:bidi="ar-SA"/>
+        <w:lang w:val="ru-RU" w:eastAsia="ru-RU" w:bidi="ar-SA"/>
       </w:rPr>
     </w:rPrDefault>
     <w:pPrDefault>
@@ -3859,6 +3840,7 @@
     <w:rPr>
       <w:rFonts w:ascii="Times New Roman" w:hAnsi="Times New Roman" w:eastAsia="Times New Roman"/>
       <w:sz w:val="24"/>
+      <w:lang w:val="ru-RU" w:eastAsia="ru-RU" w:bidi="ar-SA"/>
     </w:rPr>
   </w:style>
   <w:style w:type="paragraph" w:styleId="Header">

</xml_diff>